<commit_message>
docs: add live Vercel deployment link across README, reports, and dashboard UI
</commit_message>
<xml_diff>
--- a/docs/scrum_call_1_report.docx
+++ b/docs/scrum_call_1_report.docx
@@ -219,6 +219,52 @@
                 <w:sz w:val="19"/>
               </w:rPr>
               <w:t>https://github.com/TARUN-RKD/public-transport-dashboard</w:t>
+            </w:r>
+          </w:p>
+        </w:tc>
+      </w:tr>
+      <w:tr>
+        <w:tc>
+          <w:tcPr>
+            <w:tcW w:type="dxa" w:w="2880"/>
+            <w:shd w:fill="F3F4F6"/>
+            <w:tcMar>
+              <w:top w:w="80" w:type="dxa"/>
+              <w:bottom w:w="80" w:type="dxa"/>
+              <w:left w:w="120" w:type="dxa"/>
+              <w:right w:w="120" w:type="dxa"/>
+            </w:tcMar>
+          </w:tcPr>
+          <w:p>
+            <w:r>
+              <w:rPr>
+                <w:b/>
+                <w:color w:val="1E3A8A"/>
+                <w:sz w:val="19"/>
+              </w:rPr>
+              <w:t>Live Deployment:</w:t>
+            </w:r>
+          </w:p>
+        </w:tc>
+        <w:tc>
+          <w:tcPr>
+            <w:tcW w:type="dxa" w:w="6480"/>
+            <w:shd w:fill="FAFAFA"/>
+            <w:tcMar>
+              <w:top w:w="80" w:type="dxa"/>
+              <w:bottom w:w="80" w:type="dxa"/>
+              <w:left w:w="120" w:type="dxa"/>
+              <w:right w:w="120" w:type="dxa"/>
+            </w:tcMar>
+          </w:tcPr>
+          <w:p>
+            <w:r>
+              <w:rPr>
+                <w:b/>
+                <w:color w:val="10B981"/>
+                <w:sz w:val="19"/>
+              </w:rPr>
+              <w:t>https://public-transport-dashboard.vercel.app/</w:t>
             </w:r>
           </w:p>
         </w:tc>

</xml_diff>